<commit_message>
Circle Partner Development Associate: rescored 82 (Strong fit); profile adds stablecoin interest, community channels
Co-Authored-By: Claude Opus 5.5 <noreply@anthropic.com>
Claude-Session: https://claude.ai/code/session_01HUxzaee8VTv7sJJkCcz6f3
</commit_message>
<xml_diff>
--- a/applications/circle-partner-development-associate/Circle-PartnerDevAssociate-Resume.docx
+++ b/applications/circle-partner-development-associate/Circle-PartnerDevAssociate-Resume.docx
@@ -80,7 +80,7 @@
           <w:i w:val="0"/>
           <w:color w:val="1A1A1A"/>
         </w:rPr>
-        <w:t>Business development and partner-facing seller who qualifies fast, asks the questions that matter, and routes every serious opportunity to the right next step. Started as a BDR booking sales-ready meetings, then ranked top three of 8 to 15 reps at Accelo and managed a 15-20 reseller partner book at Birdeye with ~94% retention. Builds the lead scoring, qualification, and routing systems himself in Salesforce, HubSpot, and AI-enabled workflow tools, and keeps CRM data clean enough to trust. Fintech exposure through a banking-industry client and a finalist-stage pursuit of a major bank.</w:t>
+        <w:t>Business development and partner-facing seller who qualifies fast, asks the questions that matter, and routes every serious opportunity to the right next step. Started as a BDR booking sales-ready meetings, then ranked top three of 8 to 15 reps at Accelo and managed a 15-20 reseller partner book at Birdeye with ~94% retention. Builds the lead scoring, qualification, and routing systems himself in Salesforce, HubSpot, and AI-enabled workflow tools, and keeps CRM data clean enough to trust. Fintech exposure through a banking-industry client and a finalist-stage pursuit of a major bank, plus a genuine personal interest in stablecoins and digital assets.</w:t>
       </w:r>
     </w:p>
     <w:p>
@@ -1170,7 +1170,7 @@
           <w:i w:val="0"/>
           <w:color w:val="1A1A1A"/>
         </w:rPr>
-        <w:t>Channel &amp; Reseller Partners, Partner Onboarding, Product Feedback Loops, LinkedIn Community Engagement, Financial-Services Clients</w:t>
+        <w:t>Channel &amp; Reseller Partners, Partner Onboarding, Product Feedback Loops, Community Engagement (LinkedIn, X, Telegram, Discord), Financial-Services Clients, Stablecoins &amp; Digital Assets (personal interest)</w:t>
       </w:r>
     </w:p>
     <w:p>

</xml_diff>